<commit_message>
Update highlighted answers in review docx to match questions.json fixes
Moves the red/bold correct-answer marker for hemoglobin-3 (CO2) from E
to A, and for hemoglobin-25 (Gan chuyển hóa Bilirubin liên hợp) from B
to E, so the downloadable review docx stays in sync with the JSON
answer fixes from af85e29.

Co-Authored-By: Claude Sonnet 5 <noreply@anthropic.com>
Claude-Session: https://claude.ai/code/session_01Qp6AWQenESFUbUHaugjRV1
</commit_message>
<xml_diff>
--- a/public/lectures/10-on-tap-trac-nghiem.docx
+++ b/public/lectures/10-on-tap-trac-nghiem.docx
@@ -9097,46 +9097,47 @@
         <w:ind w:left="340"/>
       </w:pPr>
       <w:r>
-        <w:t>A. Sản phẩm của quá trình đốt cháy</w:t>
-      </w:r>
-    </w:p>
-    <w:p>
-      <w:pPr>
-        <w:spacing w:after="40"/>
-        <w:ind w:left="340"/>
-      </w:pPr>
-      <w:r>
-        <w:t>B. Ái lực với Hb lớn hơn O2</w:t>
-      </w:r>
-    </w:p>
-    <w:p>
-      <w:pPr>
-        <w:spacing w:after="40"/>
-        <w:ind w:left="340"/>
-      </w:pPr>
-      <w:r>
-        <w:t>C. Ngăn cản quá trình vận chuyển và giải phóng O2</w:t>
-      </w:r>
-    </w:p>
-    <w:p>
-      <w:pPr>
-        <w:spacing w:after="40"/>
-        <w:ind w:left="340"/>
-      </w:pPr>
-      <w:r>
-        <w:t>D. A, B, C đúng</w:t>
-      </w:r>
-    </w:p>
-    <w:p>
-      <w:pPr>
-        <w:spacing w:after="40"/>
-        <w:ind w:left="340"/>
-      </w:pPr>
-      <w:r>
         <w:rPr>
           <w:b/>
           <w:color w:val="C00000"/>
         </w:rPr>
+        <w:t>A. Sản phẩm của quá trình đốt cháy</w:t>
+      </w:r>
+    </w:p>
+    <w:p>
+      <w:pPr>
+        <w:spacing w:after="40"/>
+        <w:ind w:left="340"/>
+      </w:pPr>
+      <w:r>
+        <w:t>B. Ái lực với Hb lớn hơn O2</w:t>
+      </w:r>
+    </w:p>
+    <w:p>
+      <w:pPr>
+        <w:spacing w:after="40"/>
+        <w:ind w:left="340"/>
+      </w:pPr>
+      <w:r>
+        <w:t>C. Ngăn cản quá trình vận chuyển và giải phóng O2</w:t>
+      </w:r>
+    </w:p>
+    <w:p>
+      <w:pPr>
+        <w:spacing w:after="40"/>
+        <w:ind w:left="340"/>
+      </w:pPr>
+      <w:r>
+        <w:t>D. A, B, C đúng</w:t>
+      </w:r>
+    </w:p>
+    <w:p>
+      <w:pPr>
+        <w:spacing w:after="40"/>
+        <w:ind w:left="340"/>
+      </w:pPr>
+      <w:r>
+        <w:rPr/>
         <w:t>E. A, B, C sai</w:t>
       </w:r>
     </w:p>
@@ -10426,37 +10427,38 @@
         <w:ind w:left="340"/>
       </w:pPr>
       <w:r>
+        <w:rPr/>
+        <w:t>B. Tạo Urobilinogen, Stercobilinogen</w:t>
+      </w:r>
+    </w:p>
+    <w:p>
+      <w:pPr>
+        <w:spacing w:after="40"/>
+        <w:ind w:left="340"/>
+      </w:pPr>
+      <w:r>
+        <w:t>C. Tạo Bilirubin gián tiếp</w:t>
+      </w:r>
+    </w:p>
+    <w:p>
+      <w:pPr>
+        <w:spacing w:after="40"/>
+        <w:ind w:left="340"/>
+      </w:pPr>
+      <w:r>
+        <w:t>D. A, B, C đúng</w:t>
+      </w:r>
+    </w:p>
+    <w:p>
+      <w:pPr>
+        <w:spacing w:after="40"/>
+        <w:ind w:left="340"/>
+      </w:pPr>
+      <w:r>
         <w:rPr>
           <w:b/>
           <w:color w:val="C00000"/>
         </w:rPr>
-        <w:t>B. Tạo Urobilinogen, Stercobilinogen</w:t>
-      </w:r>
-    </w:p>
-    <w:p>
-      <w:pPr>
-        <w:spacing w:after="40"/>
-        <w:ind w:left="340"/>
-      </w:pPr>
-      <w:r>
-        <w:t>C. Tạo Bilirubin gián tiếp</w:t>
-      </w:r>
-    </w:p>
-    <w:p>
-      <w:pPr>
-        <w:spacing w:after="40"/>
-        <w:ind w:left="340"/>
-      </w:pPr>
-      <w:r>
-        <w:t>D. A, B, C đúng</w:t>
-      </w:r>
-    </w:p>
-    <w:p>
-      <w:pPr>
-        <w:spacing w:after="40"/>
-        <w:ind w:left="340"/>
-      </w:pPr>
-      <w:r>
         <w:t>E. A, B, C sai</w:t>
       </w:r>
     </w:p>

</xml_diff>

<commit_message>
Correct 7 more answers after re-verifying against original lecture slides
Fixes protid-1, protid-2, protid-4, protid-9, protid-13 and lipid-8, and
clears the unverified flag on protid-2/protid-5 now that the correct
options are confirmed. Also syncs the highlighted correct answer in the
downloadable review docx (root copy and public/lectures) to match.

Co-Authored-By: Claude Sonnet 5 <noreply@anthropic.com>
</commit_message>
<xml_diff>
--- a/public/lectures/10-on-tap-trac-nghiem.docx
+++ b/public/lectures/10-on-tap-trac-nghiem.docx
@@ -2595,37 +2595,38 @@
         <w:ind w:left="340"/>
       </w:pPr>
       <w:r>
+        <w:rPr/>
+        <w:t>B. Glycerophospholipid có tính lưỡng cực, đảm bảo tính bán thấm cho các cấu trúc tế nào</w:t>
+      </w:r>
+    </w:p>
+    <w:p>
+      <w:pPr>
+        <w:spacing w:after="40"/>
+        <w:ind w:left="340"/>
+      </w:pPr>
+      <w:r>
+        <w:t>C. MGDG, DGDG là Glycopeptid khá phổ biến trong lục lạp và các thành phần khác của tế bào ở lá</w:t>
+      </w:r>
+    </w:p>
+    <w:p>
+      <w:pPr>
+        <w:spacing w:after="40"/>
+        <w:ind w:left="340"/>
+      </w:pPr>
+      <w:r>
+        <w:t>D. Cholesterol chỉ có ở động vật</w:t>
+      </w:r>
+    </w:p>
+    <w:p>
+      <w:pPr>
+        <w:spacing w:after="40"/>
+        <w:ind w:left="340"/>
+      </w:pPr>
+      <w:r>
         <w:rPr>
           <w:b/>
           <w:color w:val="C00000"/>
         </w:rPr>
-        <w:t>B. Glycerophospholipid có tính lưỡng cực, đảm bảo tính bán thấm cho các cấu trúc tế nào</w:t>
-      </w:r>
-    </w:p>
-    <w:p>
-      <w:pPr>
-        <w:spacing w:after="40"/>
-        <w:ind w:left="340"/>
-      </w:pPr>
-      <w:r>
-        <w:t>C. MGDG, DGDG là Glycopeptid khá phổ biến trong lục lạp và các thành phần khác của tế bào ở lá</w:t>
-      </w:r>
-    </w:p>
-    <w:p>
-      <w:pPr>
-        <w:spacing w:after="40"/>
-        <w:ind w:left="340"/>
-      </w:pPr>
-      <w:r>
-        <w:t>D. Cholesterol chỉ có ở động vật</w:t>
-      </w:r>
-    </w:p>
-    <w:p>
-      <w:pPr>
-        <w:spacing w:after="40"/>
-        <w:ind w:left="340"/>
-      </w:pPr>
-      <w:r>
         <w:t>E. Tất cả đều đúng</w:t>
       </w:r>
     </w:p>
@@ -3379,28 +3380,29 @@
         <w:ind w:left="340"/>
       </w:pPr>
       <w:r>
+        <w:rPr/>
+        <w:t>A. 10</w:t>
+      </w:r>
+    </w:p>
+    <w:p>
+      <w:pPr>
+        <w:spacing w:after="40"/>
+        <w:ind w:left="340"/>
+      </w:pPr>
+      <w:r>
+        <w:t>B. 15</w:t>
+      </w:r>
+    </w:p>
+    <w:p>
+      <w:pPr>
+        <w:spacing w:after="40"/>
+        <w:ind w:left="340"/>
+      </w:pPr>
+      <w:r>
         <w:rPr>
           <w:b/>
           <w:color w:val="C00000"/>
         </w:rPr>
-        <w:t>A. 10</w:t>
-      </w:r>
-    </w:p>
-    <w:p>
-      <w:pPr>
-        <w:spacing w:after="40"/>
-        <w:ind w:left="340"/>
-      </w:pPr>
-      <w:r>
-        <w:t>B. 15</w:t>
-      </w:r>
-    </w:p>
-    <w:p>
-      <w:pPr>
-        <w:spacing w:after="40"/>
-        <w:ind w:left="340"/>
-      </w:pPr>
-      <w:r>
         <w:t>C. 20</w:t>
       </w:r>
     </w:p>
@@ -3440,15 +3442,6 @@
       </w:pPr>
       <w:r>
         <w:t>A. 2</w:t>
-      </w:r>
-    </w:p>
-    <w:p>
-      <w:pPr>
-        <w:spacing w:after="40"/>
-        <w:ind w:left="340"/>
-      </w:pPr>
-      <w:r>
-        <w:t>B. 5</w:t>
       </w:r>
     </w:p>
     <w:p>
@@ -3461,6 +3454,16 @@
           <w:b/>
           <w:color w:val="C00000"/>
         </w:rPr>
+        <w:t>B. 5</w:t>
+      </w:r>
+    </w:p>
+    <w:p>
+      <w:pPr>
+        <w:spacing w:after="40"/>
+        <w:ind w:left="340"/>
+      </w:pPr>
+      <w:r>
+        <w:rPr/>
         <w:t>C. 13</w:t>
       </w:r>
     </w:p>
@@ -3559,19 +3562,20 @@
         <w:ind w:left="340"/>
       </w:pPr>
       <w:r>
-        <w:t>A. Asparagin</w:t>
-      </w:r>
-    </w:p>
-    <w:p>
-      <w:pPr>
-        <w:spacing w:after="40"/>
-        <w:ind w:left="340"/>
-      </w:pPr>
-      <w:r>
         <w:rPr>
           <w:b/>
           <w:color w:val="C00000"/>
         </w:rPr>
+        <w:t>A. Asparagin</w:t>
+      </w:r>
+    </w:p>
+    <w:p>
+      <w:pPr>
+        <w:spacing w:after="40"/>
+        <w:ind w:left="340"/>
+      </w:pPr>
+      <w:r>
+        <w:rPr/>
         <w:t>B. Glycin</w:t>
       </w:r>
     </w:p>
@@ -3611,24 +3615,6 @@
           <w:b/>
         </w:rPr>
         <w:t>Câu 5: Chọn Acid amin có tính kiềm.</w:t>
-      </w:r>
-    </w:p>
-    <w:p>
-      <w:pPr>
-        <w:spacing w:after="40"/>
-        <w:ind w:left="340"/>
-      </w:pPr>
-      <w:r>
-        <w:t>A. Asparagin</w:t>
-      </w:r>
-    </w:p>
-    <w:p>
-      <w:pPr>
-        <w:spacing w:after="40"/>
-        <w:ind w:left="340"/>
-      </w:pPr>
-      <w:r>
-        <w:t>B. Serin</w:t>
       </w:r>
     </w:p>
     <w:p>
@@ -3641,6 +3627,25 @@
           <w:b/>
           <w:color w:val="C00000"/>
         </w:rPr>
+        <w:t>A. Asparagin</w:t>
+      </w:r>
+    </w:p>
+    <w:p>
+      <w:pPr>
+        <w:spacing w:after="40"/>
+        <w:ind w:left="340"/>
+      </w:pPr>
+      <w:r>
+        <w:t>B. Serin</w:t>
+      </w:r>
+    </w:p>
+    <w:p>
+      <w:pPr>
+        <w:spacing w:after="40"/>
+        <w:ind w:left="340"/>
+      </w:pPr>
+      <w:r>
+        <w:rPr/>
         <w:t>C. Alanin</w:t>
       </w:r>
     </w:p>
@@ -3868,28 +3873,29 @@
         <w:ind w:left="340"/>
       </w:pPr>
       <w:r>
+        <w:rPr/>
+        <w:t>B. 9</w:t>
+      </w:r>
+    </w:p>
+    <w:p>
+      <w:pPr>
+        <w:spacing w:after="40"/>
+        <w:ind w:left="340"/>
+      </w:pPr>
+      <w:r>
+        <w:t>C. 19</w:t>
+      </w:r>
+    </w:p>
+    <w:p>
+      <w:pPr>
+        <w:spacing w:after="40"/>
+        <w:ind w:left="340"/>
+      </w:pPr>
+      <w:r>
         <w:rPr>
           <w:b/>
           <w:color w:val="C00000"/>
         </w:rPr>
-        <w:t>B. 9</w:t>
-      </w:r>
-    </w:p>
-    <w:p>
-      <w:pPr>
-        <w:spacing w:after="40"/>
-        <w:ind w:left="340"/>
-      </w:pPr>
-      <w:r>
-        <w:t>C. 19</w:t>
-      </w:r>
-    </w:p>
-    <w:p>
-      <w:pPr>
-        <w:spacing w:after="40"/>
-        <w:ind w:left="340"/>
-      </w:pPr>
-      <w:r>
         <w:t>D. 13</w:t>
       </w:r>
     </w:p>
@@ -4099,46 +4105,47 @@
         <w:ind w:left="340"/>
       </w:pPr>
       <w:r>
+        <w:rPr/>
+        <w:t>A. 10%</w:t>
+      </w:r>
+    </w:p>
+    <w:p>
+      <w:pPr>
+        <w:spacing w:after="40"/>
+        <w:ind w:left="340"/>
+      </w:pPr>
+      <w:r>
+        <w:t>B. 8%</w:t>
+      </w:r>
+    </w:p>
+    <w:p>
+      <w:pPr>
+        <w:spacing w:after="40"/>
+        <w:ind w:left="340"/>
+      </w:pPr>
+      <w:r>
+        <w:t>C. 6%</w:t>
+      </w:r>
+    </w:p>
+    <w:p>
+      <w:pPr>
+        <w:spacing w:after="40"/>
+        <w:ind w:left="340"/>
+      </w:pPr>
+      <w:r>
+        <w:t>D. 4%</w:t>
+      </w:r>
+    </w:p>
+    <w:p>
+      <w:pPr>
+        <w:spacing w:after="40"/>
+        <w:ind w:left="340"/>
+      </w:pPr>
+      <w:r>
         <w:rPr>
           <w:b/>
           <w:color w:val="C00000"/>
         </w:rPr>
-        <w:t>A. 10%</w:t>
-      </w:r>
-    </w:p>
-    <w:p>
-      <w:pPr>
-        <w:spacing w:after="40"/>
-        <w:ind w:left="340"/>
-      </w:pPr>
-      <w:r>
-        <w:t>B. 8%</w:t>
-      </w:r>
-    </w:p>
-    <w:p>
-      <w:pPr>
-        <w:spacing w:after="40"/>
-        <w:ind w:left="340"/>
-      </w:pPr>
-      <w:r>
-        <w:t>C. 6%</w:t>
-      </w:r>
-    </w:p>
-    <w:p>
-      <w:pPr>
-        <w:spacing w:after="40"/>
-        <w:ind w:left="340"/>
-      </w:pPr>
-      <w:r>
-        <w:t>D. 4%</w:t>
-      </w:r>
-    </w:p>
-    <w:p>
-      <w:pPr>
-        <w:spacing w:after="40"/>
-        <w:ind w:left="340"/>
-      </w:pPr>
-      <w:r>
         <w:t>E. 2%</w:t>
       </w:r>
     </w:p>

</xml_diff>

<commit_message>
Sync review docx highlights with questions.json for 8 stale entries
Full audit of all 174 questions found the review docx (root copy and
public/lectures) still highlighting outdated answers for glucid-18,
glucid-21, glucid-24, glucid-26, lipid-20, protid-7 and hemoglobin-18
(left unhighlighted since it has no confirmed correct answer), plus a
leftover mmHg unit on can-bang-acid-base-4 where the json now uses
mmol/l. Re-verified all 174 questions match exactly between json and
both docx copies.

Co-Authored-By: Claude Sonnet 5 <noreply@anthropic.com>
</commit_message>
<xml_diff>
--- a/public/lectures/10-on-tap-trac-nghiem.docx
+++ b/public/lectures/10-on-tap-trac-nghiem.docx
@@ -1073,28 +1073,29 @@
         <w:ind w:left="340"/>
       </w:pPr>
       <w:r>
-        <w:t>A. Cellulose</w:t>
-      </w:r>
-    </w:p>
-    <w:p>
-      <w:pPr>
-        <w:spacing w:after="40"/>
-        <w:ind w:left="340"/>
-      </w:pPr>
-      <w:r>
-        <w:t>B. Pectin</w:t>
-      </w:r>
-    </w:p>
-    <w:p>
-      <w:pPr>
-        <w:spacing w:after="40"/>
-        <w:ind w:left="340"/>
-      </w:pPr>
-      <w:r>
         <w:rPr>
           <w:b/>
           <w:color w:val="C00000"/>
         </w:rPr>
+        <w:t>A. Cellulose</w:t>
+      </w:r>
+    </w:p>
+    <w:p>
+      <w:pPr>
+        <w:spacing w:after="40"/>
+        <w:ind w:left="340"/>
+      </w:pPr>
+      <w:r>
+        <w:t>B. Pectin</w:t>
+      </w:r>
+    </w:p>
+    <w:p>
+      <w:pPr>
+        <w:spacing w:after="40"/>
+        <w:ind w:left="340"/>
+      </w:pPr>
+      <w:r>
+        <w:rPr/>
         <w:t>C. Glycogen</w:t>
       </w:r>
     </w:p>
@@ -1253,37 +1254,38 @@
         <w:ind w:left="340"/>
       </w:pPr>
       <w:r>
+        <w:rPr/>
+        <w:t>A. Cellulose</w:t>
+      </w:r>
+    </w:p>
+    <w:p>
+      <w:pPr>
+        <w:spacing w:after="40"/>
+        <w:ind w:left="340"/>
+      </w:pPr>
+      <w:r>
+        <w:t>B. Inulin</w:t>
+      </w:r>
+    </w:p>
+    <w:p>
+      <w:pPr>
+        <w:spacing w:after="40"/>
+        <w:ind w:left="340"/>
+      </w:pPr>
+      <w:r>
+        <w:t>C. Heparin</w:t>
+      </w:r>
+    </w:p>
+    <w:p>
+      <w:pPr>
+        <w:spacing w:after="40"/>
+        <w:ind w:left="340"/>
+      </w:pPr>
+      <w:r>
         <w:rPr>
           <w:b/>
           <w:color w:val="C00000"/>
         </w:rPr>
-        <w:t>A. Cellulose</w:t>
-      </w:r>
-    </w:p>
-    <w:p>
-      <w:pPr>
-        <w:spacing w:after="40"/>
-        <w:ind w:left="340"/>
-      </w:pPr>
-      <w:r>
-        <w:t>B. Inulin</w:t>
-      </w:r>
-    </w:p>
-    <w:p>
-      <w:pPr>
-        <w:spacing w:after="40"/>
-        <w:ind w:left="340"/>
-      </w:pPr>
-      <w:r>
-        <w:t>C. Heparin</w:t>
-      </w:r>
-    </w:p>
-    <w:p>
-      <w:pPr>
-        <w:spacing w:after="40"/>
-        <w:ind w:left="340"/>
-      </w:pPr>
-      <w:r>
         <w:t>D. Glycogen</w:t>
       </w:r>
     </w:p>
@@ -1442,28 +1444,29 @@
         <w:ind w:left="340"/>
       </w:pPr>
       <w:r>
+        <w:rPr/>
+        <w:t>B. (1)pentose phosphat, (2) Glucose-6P</w:t>
+      </w:r>
+    </w:p>
+    <w:p>
+      <w:pPr>
+        <w:spacing w:after="40"/>
+        <w:ind w:left="340"/>
+      </w:pPr>
+      <w:r>
+        <w:t>C. (1)monophosphat, (2) Glucose-1P</w:t>
+      </w:r>
+    </w:p>
+    <w:p>
+      <w:pPr>
+        <w:spacing w:after="40"/>
+        <w:ind w:left="340"/>
+      </w:pPr>
+      <w:r>
         <w:rPr>
           <w:b/>
           <w:color w:val="C00000"/>
         </w:rPr>
-        <w:t>B. (1)pentose phosphat, (2) Glucose-6P</w:t>
-      </w:r>
-    </w:p>
-    <w:p>
-      <w:pPr>
-        <w:spacing w:after="40"/>
-        <w:ind w:left="340"/>
-      </w:pPr>
-      <w:r>
-        <w:t>C. (1)monophosphat, (2) Glucose-1P</w:t>
-      </w:r>
-    </w:p>
-    <w:p>
-      <w:pPr>
-        <w:spacing w:after="40"/>
-        <w:ind w:left="340"/>
-      </w:pPr>
-      <w:r>
         <w:t>D. A và B đúng</w:t>
       </w:r>
     </w:p>
@@ -1571,28 +1574,29 @@
         <w:ind w:left="340"/>
       </w:pPr>
       <w:r>
+        <w:rPr/>
+        <w:t>C. (1) Glyceraldehyde-3-P, (2) 1,3 biphosphoglycerate</w:t>
+      </w:r>
+    </w:p>
+    <w:p>
+      <w:pPr>
+        <w:spacing w:after="40"/>
+        <w:ind w:left="340"/>
+      </w:pPr>
+      <w:r>
+        <w:t>D. (1) 3P-glycerate, (2) 1,3 biphosphoglycerate</w:t>
+      </w:r>
+    </w:p>
+    <w:p>
+      <w:pPr>
+        <w:spacing w:after="40"/>
+        <w:ind w:left="340"/>
+      </w:pPr>
+      <w:r>
         <w:rPr>
           <w:b/>
           <w:color w:val="C00000"/>
         </w:rPr>
-        <w:t>C. (1) Glyceraldehyde-3-P, (2) 1,3 biphosphoglycerate</w:t>
-      </w:r>
-    </w:p>
-    <w:p>
-      <w:pPr>
-        <w:spacing w:after="40"/>
-        <w:ind w:left="340"/>
-      </w:pPr>
-      <w:r>
-        <w:t>D. (1) 3P-glycerate, (2) 1,3 biphosphoglycerate</w:t>
-      </w:r>
-    </w:p>
-    <w:p>
-      <w:pPr>
-        <w:spacing w:after="40"/>
-        <w:ind w:left="340"/>
-      </w:pPr>
-      <w:r>
         <w:t>E. Tất cả đều sai</w:t>
       </w:r>
     </w:p>
@@ -3325,28 +3329,29 @@
         <w:ind w:left="340"/>
       </w:pPr>
       <w:r>
+        <w:rPr/>
+        <w:t>C. GH</w:t>
+      </w:r>
+    </w:p>
+    <w:p>
+      <w:pPr>
+        <w:spacing w:after="40"/>
+        <w:ind w:left="340"/>
+      </w:pPr>
+      <w:r>
+        <w:t>D. PGE1</w:t>
+      </w:r>
+    </w:p>
+    <w:p>
+      <w:pPr>
+        <w:spacing w:after="40"/>
+        <w:ind w:left="340"/>
+      </w:pPr>
+      <w:r>
         <w:rPr>
           <w:b/>
           <w:color w:val="C00000"/>
         </w:rPr>
-        <w:t>C. GH</w:t>
-      </w:r>
-    </w:p>
-    <w:p>
-      <w:pPr>
-        <w:spacing w:after="40"/>
-        <w:ind w:left="340"/>
-      </w:pPr>
-      <w:r>
-        <w:t>D. PGE1</w:t>
-      </w:r>
-    </w:p>
-    <w:p>
-      <w:pPr>
-        <w:spacing w:after="40"/>
-        <w:ind w:left="340"/>
-      </w:pPr>
-      <w:r>
         <w:t>E. Cortisol</w:t>
       </w:r>
     </w:p>
@@ -3753,28 +3758,29 @@
         <w:ind w:left="340"/>
       </w:pPr>
       <w:r>
+        <w:rPr/>
+        <w:t>B. Liên kết Hydro</w:t>
+      </w:r>
+    </w:p>
+    <w:p>
+      <w:pPr>
+        <w:spacing w:after="40"/>
+        <w:ind w:left="340"/>
+      </w:pPr>
+      <w:r>
+        <w:t>C. Liên kết disulfit</w:t>
+      </w:r>
+    </w:p>
+    <w:p>
+      <w:pPr>
+        <w:spacing w:after="40"/>
+        <w:ind w:left="340"/>
+      </w:pPr>
+      <w:r>
         <w:rPr>
           <w:b/>
           <w:color w:val="C00000"/>
         </w:rPr>
-        <w:t>B. Liên kết Hydro</w:t>
-      </w:r>
-    </w:p>
-    <w:p>
-      <w:pPr>
-        <w:spacing w:after="40"/>
-        <w:ind w:left="340"/>
-      </w:pPr>
-      <w:r>
-        <w:t>C. Liên kết disulfit</w:t>
-      </w:r>
-    </w:p>
-    <w:p>
-      <w:pPr>
-        <w:spacing w:after="40"/>
-        <w:ind w:left="340"/>
-      </w:pPr>
-      <w:r>
         <w:t>D. A và B đúng</w:t>
       </w:r>
     </w:p>
@@ -7938,25 +7944,25 @@
         <w:ind w:left="340"/>
       </w:pPr>
       <w:r>
-        <w:t>A. 40 ± 4 mmHg</w:t>
-      </w:r>
-    </w:p>
-    <w:p>
-      <w:pPr>
-        <w:spacing w:after="40"/>
-        <w:ind w:left="340"/>
-      </w:pPr>
-      <w:r>
-        <w:t>B. 44 ± 4 mmHg</w:t>
-      </w:r>
-    </w:p>
-    <w:p>
-      <w:pPr>
-        <w:spacing w:after="40"/>
-        <w:ind w:left="340"/>
-      </w:pPr>
-      <w:r>
-        <w:t>C. 36 ± 4 mmHg</w:t>
+        <w:t>A. 40 ± 4 mmol/l</w:t>
+      </w:r>
+    </w:p>
+    <w:p>
+      <w:pPr>
+        <w:spacing w:after="40"/>
+        <w:ind w:left="340"/>
+      </w:pPr>
+      <w:r>
+        <w:t>B. 44 ± 4 mmol/l</w:t>
+      </w:r>
+    </w:p>
+    <w:p>
+      <w:pPr>
+        <w:spacing w:after="40"/>
+        <w:ind w:left="340"/>
+      </w:pPr>
+      <w:r>
+        <w:t>C. 36 ± 4 mmol/l</w:t>
       </w:r>
     </w:p>
     <w:p>
@@ -7969,7 +7975,7 @@
           <w:b/>
           <w:color w:val="C00000"/>
         </w:rPr>
-        <w:t>D. 25 ± 5 mmHg</w:t>
+        <w:t>D. 25 ± 5 mmol/l</w:t>
       </w:r>
     </w:p>
     <w:p>
@@ -10032,10 +10038,7 @@
         <w:ind w:left="340"/>
       </w:pPr>
       <w:r>
-        <w:rPr>
-          <w:b/>
-          <w:color w:val="C00000"/>
-        </w:rPr>
+        <w:rPr/>
         <w:t>D. IX</w:t>
       </w:r>
     </w:p>

</xml_diff>

<commit_message>
Correct protid-27 and acid-nucleic-9 answers after re-verification
protid-27 (khử amin diễn ra ở đâu): correct answer is D (A và B đúng)
since khử amin can happen both oxy hóa (ty thể) and không oxy hóa
(bào tương), not just A alone.

acid-nucleic-9 (nhận định đúng về Nucleic): all of A-D are correct
statements, so the correct answer is E (Tất cả đều đúng).

Syncs the highlighted answer in both the root and public/lectures
copies of the downloadable review docx to match.

Co-Authored-By: Claude Sonnet 5 <noreply@anthropic.com>
</commit_message>
<xml_diff>
--- a/public/lectures/10-on-tap-trac-nghiem.docx
+++ b/public/lectures/10-on-tap-trac-nghiem.docx
@@ -4952,37 +4952,37 @@
         <w:ind w:left="340"/>
       </w:pPr>
       <w:r>
+        <w:t>A. Ty thể</w:t>
+      </w:r>
+    </w:p>
+    <w:p>
+      <w:pPr>
+        <w:spacing w:after="40"/>
+        <w:ind w:left="340"/>
+      </w:pPr>
+      <w:r>
+        <w:t>B. Bào tương</w:t>
+      </w:r>
+    </w:p>
+    <w:p>
+      <w:pPr>
+        <w:spacing w:after="40"/>
+        <w:ind w:left="340"/>
+      </w:pPr>
+      <w:r>
+        <w:t>C. Ribosom</w:t>
+      </w:r>
+    </w:p>
+    <w:p>
+      <w:pPr>
+        <w:spacing w:after="40"/>
+        <w:ind w:left="340"/>
+      </w:pPr>
+      <w:r>
         <w:rPr>
           <w:b/>
           <w:color w:val="C00000"/>
         </w:rPr>
-        <w:t>A. Ty thể</w:t>
-      </w:r>
-    </w:p>
-    <w:p>
-      <w:pPr>
-        <w:spacing w:after="40"/>
-        <w:ind w:left="340"/>
-      </w:pPr>
-      <w:r>
-        <w:t>B. Bào tương</w:t>
-      </w:r>
-    </w:p>
-    <w:p>
-      <w:pPr>
-        <w:spacing w:after="40"/>
-        <w:ind w:left="340"/>
-      </w:pPr>
-      <w:r>
-        <w:t>C. Ribosom</w:t>
-      </w:r>
-    </w:p>
-    <w:p>
-      <w:pPr>
-        <w:spacing w:after="40"/>
-        <w:ind w:left="340"/>
-      </w:pPr>
-      <w:r>
         <w:t>D. A và B đúng</w:t>
       </w:r>
     </w:p>
@@ -6003,28 +6003,28 @@
         <w:ind w:left="340"/>
       </w:pPr>
       <w:r>
+        <w:t>C. Các Nucleic có chứa các nguyên tố C, H, O, N và P</w:t>
+      </w:r>
+    </w:p>
+    <w:p>
+      <w:pPr>
+        <w:spacing w:after="40"/>
+        <w:ind w:left="340"/>
+      </w:pPr>
+      <w:r>
+        <w:t>D. Ribosome của mọi tế bào đều gồm một tiểu đơn vị nhỏ và một tiểu đơn vị lớn</w:t>
+      </w:r>
+    </w:p>
+    <w:p>
+      <w:pPr>
+        <w:spacing w:after="40"/>
+        <w:ind w:left="340"/>
+      </w:pPr>
+      <w:r>
         <w:rPr>
           <w:b/>
           <w:color w:val="C00000"/>
         </w:rPr>
-        <w:t>C. Các Nucleic có chứa các nguyên tố C, H, O, N và P</w:t>
-      </w:r>
-    </w:p>
-    <w:p>
-      <w:pPr>
-        <w:spacing w:after="40"/>
-        <w:ind w:left="340"/>
-      </w:pPr>
-      <w:r>
-        <w:t>D. Ribosome của mọi tế bào đều gồm một tiểu đơn vị nhỏ và một tiểu đơn vị lớn</w:t>
-      </w:r>
-    </w:p>
-    <w:p>
-      <w:pPr>
-        <w:spacing w:after="40"/>
-        <w:ind w:left="340"/>
-      </w:pPr>
-      <w:r>
         <w:t>E. Tất cả đều đúng</w:t>
       </w:r>
     </w:p>

</xml_diff>